<commit_message>
Deliver Sprint 4: Explorer menu, single-pass tag reads, machine workers
The 1.4.0 sprint adds a per-user Windows Explorer context menu, removes the
duplicate tag-handler loads behind the batch readers, and replaces the fixed
four-worker default with one per logical CPU capped at eight. It records the
measured rejection of batch FFmpeg and locks the worker count, slot grid,
typed-worker cap and changelog format so the sprint's guarantees cannot
regress.

Generated with Codebuff 🤖
Co-Authored-By: Codebuff <noreply@codebuff.com>
</commit_message>
<xml_diff>
--- a/user_guides/individual_programs/tempo_analyzer/Tempo_Analyzer_User_Guide.docx
+++ b/user_guides/individual_programs/tempo_analyzer/Tempo_Analyzer_User_Guide.docx
@@ -168,7 +168,7 @@
         <w:t xml:space="preserve">Parallel processing: </w:t>
       </w:r>
       <w:r>
-        <w:t>4 concurrent worker slots show live per-file progress.</w:t>
+        <w:t>Up to 8 concurrent worker slots show live per-file progress.</w:t>
       </w:r>
     </w:p>
     <w:p>
@@ -344,7 +344,7 @@
           </w:tcPr>
           <w:p>
             <w:r>
-              <w:t>Multi-core recommended (4+ workers for full parallel performance)</w:t>
+              <w:t>Multi-core recommended (up to 8 workers for full parallel performance)</w:t>
             </w:r>
           </w:p>
         </w:tc>
@@ -2478,7 +2478,7 @@
         <w:pStyle w:val="ListBullet"/>
       </w:pPr>
       <w:r>
-        <w:t>Worker status panel showing all 4 parallel workers and the file each is currently processing</w:t>
+        <w:t>Worker status panel showing up to 8 parallel workers and the file each is currently processing</w:t>
       </w:r>
     </w:p>
     <w:p>
@@ -4250,7 +4250,7 @@
           </w:tcPr>
           <w:p>
             <w:r>
-              <w:t>4 concurrent worker slots via a thread pool</w:t>
+              <w:t>Up to 8 concurrent worker slots via a thread pool</w:t>
             </w:r>
           </w:p>
         </w:tc>

</xml_diff>